<commit_message>
feat(clearance): render picked manager's signature in HR Manager cell
The Employee Clearance Form had no signature image token, so the manager
picker had nowhere to render on the generated document. Adds a
{{ manager_sig }} token to the 'HR Manager' signing cell (table 4). The
backend already resolves the picked manager's stored signature
(manager_override -> sig1_path -> manager_sig_path -> {{ manager_sig }}) and
manager auto-embed is on for this form (default 'auto' signing path), so the
picked manager's signature now embeds. Verified via a rendered preview: sig
lands in the HR Manager cell, rest of the form intact.

Submitter signature deferred (no {{ submitter_sig }} token yet; the on-file
submitter has no stored signature).

Co-Authored-By: Claude Opus 4.8 (1M context) <noreply@anthropic.com>
</commit_message>
<xml_diff>
--- a/backend/templates/GSSG-HR_300-009_Employee_Clearance_Form_.docx
+++ b/backend/templates/GSSG-HR_300-009_Employee_Clearance_Form_.docx
@@ -8311,11 +8311,15 @@
           <w:p>
             <w:pPr>
               <w:pStyle w:val="TableParagraph"/>
+              <w:jc w:val="center"/>
               <w:rPr>
                 <w:rFonts w:ascii="Times New Roman"/>
                 <w:sz w:val="14"/>
               </w:rPr>
             </w:pPr>
+            <w:r>
+              <w:t>{{ manager_sig }}</w:t>
+            </w:r>
           </w:p>
         </w:tc>
         <w:tc>

</xml_diff>

<commit_message>
fix(clearance): sync row list to renumbered template + keep manager sig
The clearance template was renumbered: 'Documents' (a column header) lost its
stray clearance(2,1) token, and 'Laptop/Desktop' became a real clearance item
at 3_1, shifting table-3 items down to end at 3_14. The frontend ClearanceTableField
row list still used the old numbering, which would print marks on the wrong rows
once deployed.

- ClearanceTableField ROWS now match the template exactly: table 2 rows 2..22
  (Documents header dropped), table 3 rows 1..14 (Laptop/Desktop = 3_1).
- i18n: add clearance.items.laptop_desktop (EN/AR), drop dead 'documents' key.
- Template: reconciled the renumbered copy with the {{ manager_sig }} token in
  the HR Manager cell (the two edits lived on divergent branches). Verified via
  strict render + PDF: marks land on the right rows and the manager signature
  embeds.

Co-Authored-By: Claude Opus 4.8 (1M context) <noreply@anthropic.com>
</commit_message>
<xml_diff>
--- a/backend/templates/GSSG-HR_300-009_Employee_Clearance_Form_.docx
+++ b/backend/templates/GSSG-HR_300-009_Employee_Clearance_Form_.docx
@@ -1584,7 +1584,6 @@
             </w:pPr>
             <w:r>
               <w:rPr>
-                <w:rFonts w:ascii="Arial" w:hAnsi="Arial"/>
                 <w:color w:val="000000"/>
                 <w:sz w:val="20"/>
               </w:rPr>
@@ -1650,7 +1649,6 @@
             </w:pPr>
             <w:r>
               <w:rPr>
-                <w:rFonts w:ascii="Arial" w:hAnsi="Arial"/>
                 <w:color w:val="000000"/>
                 <w:sz w:val="20"/>
               </w:rPr>
@@ -1704,7 +1702,6 @@
             </w:pPr>
             <w:r>
               <w:rPr>
-                <w:rFonts w:ascii="Arial" w:hAnsi="Arial"/>
                 <w:color w:val="000000"/>
                 <w:sz w:val="20"/>
               </w:rPr>
@@ -1770,7 +1767,6 @@
             </w:pPr>
             <w:r>
               <w:rPr>
-                <w:rFonts w:ascii="Arial" w:hAnsi="Arial"/>
                 <w:color w:val="000000"/>
                 <w:sz w:val="20"/>
               </w:rPr>
@@ -1824,7 +1820,6 @@
             </w:pPr>
             <w:r>
               <w:rPr>
-                <w:rFonts w:ascii="Arial" w:hAnsi="Arial"/>
                 <w:color w:val="000000"/>
                 <w:sz w:val="20"/>
               </w:rPr>
@@ -1875,7 +1870,6 @@
             </w:pPr>
             <w:r>
               <w:rPr>
-                <w:rFonts w:ascii="Arial" w:hAnsi="Arial"/>
                 <w:color w:val="000000"/>
                 <w:sz w:val="20"/>
               </w:rPr>
@@ -1959,7 +1953,6 @@
             </w:pPr>
             <w:r>
               <w:rPr>
-                <w:rFonts w:ascii="Arial" w:hAnsi="Arial"/>
                 <w:color w:val="000000"/>
                 <w:sz w:val="20"/>
               </w:rPr>
@@ -2024,7 +2017,6 @@
             </w:pPr>
             <w:r>
               <w:rPr>
-                <w:rFonts w:ascii="Arial" w:hAnsi="Arial"/>
                 <w:color w:val="000000"/>
                 <w:sz w:val="20"/>
               </w:rPr>
@@ -2134,14 +2126,6 @@
                 <w:sz w:val="18"/>
               </w:rPr>
             </w:pPr>
-            <w:r>
-              <w:rPr>
-                <w:rFonts w:ascii="Arial" w:hAnsi="Arial"/>
-                <w:color w:val="000000"/>
-                <w:sz w:val="20"/>
-              </w:rPr>
-              <w:t>{{ clearance(2, 1) }}</w:t>
-            </w:r>
           </w:p>
         </w:tc>
         <w:tc>
@@ -2648,7 +2632,6 @@
             </w:pPr>
             <w:r>
               <w:rPr>
-                <w:rFonts w:ascii="Arial" w:hAnsi="Arial"/>
                 <w:color w:val="000000"/>
                 <w:sz w:val="20"/>
               </w:rPr>
@@ -2771,7 +2754,6 @@
             </w:pPr>
             <w:r>
               <w:rPr>
-                <w:rFonts w:ascii="Arial" w:hAnsi="Arial"/>
                 <w:color w:val="000000"/>
                 <w:sz w:val="20"/>
               </w:rPr>
@@ -2886,7 +2868,6 @@
             </w:pPr>
             <w:r>
               <w:rPr>
-                <w:rFonts w:ascii="Arial" w:hAnsi="Arial"/>
                 <w:color w:val="000000"/>
                 <w:sz w:val="20"/>
               </w:rPr>
@@ -2994,7 +2975,6 @@
             </w:pPr>
             <w:r>
               <w:rPr>
-                <w:rFonts w:ascii="Arial" w:hAnsi="Arial"/>
                 <w:color w:val="000000"/>
                 <w:sz w:val="20"/>
               </w:rPr>
@@ -3102,7 +3082,6 @@
             </w:pPr>
             <w:r>
               <w:rPr>
-                <w:rFonts w:ascii="Arial" w:hAnsi="Arial"/>
                 <w:color w:val="000000"/>
                 <w:sz w:val="20"/>
               </w:rPr>
@@ -3210,7 +3189,6 @@
             </w:pPr>
             <w:r>
               <w:rPr>
-                <w:rFonts w:ascii="Arial" w:hAnsi="Arial"/>
                 <w:color w:val="000000"/>
                 <w:sz w:val="20"/>
               </w:rPr>
@@ -3333,7 +3311,6 @@
             </w:pPr>
             <w:r>
               <w:rPr>
-                <w:rFonts w:ascii="Arial" w:hAnsi="Arial"/>
                 <w:color w:val="000000"/>
                 <w:sz w:val="20"/>
               </w:rPr>
@@ -3441,7 +3418,6 @@
             </w:pPr>
             <w:r>
               <w:rPr>
-                <w:rFonts w:ascii="Arial" w:hAnsi="Arial"/>
                 <w:color w:val="000000"/>
                 <w:sz w:val="20"/>
               </w:rPr>
@@ -3564,7 +3540,6 @@
             </w:pPr>
             <w:r>
               <w:rPr>
-                <w:rFonts w:ascii="Arial" w:hAnsi="Arial"/>
                 <w:color w:val="000000"/>
                 <w:sz w:val="20"/>
               </w:rPr>
@@ -3672,7 +3647,6 @@
             </w:pPr>
             <w:r>
               <w:rPr>
-                <w:rFonts w:ascii="Arial" w:hAnsi="Arial"/>
                 <w:color w:val="000000"/>
                 <w:sz w:val="20"/>
               </w:rPr>
@@ -3795,7 +3769,6 @@
             </w:pPr>
             <w:r>
               <w:rPr>
-                <w:rFonts w:ascii="Arial" w:hAnsi="Arial"/>
                 <w:color w:val="000000"/>
                 <w:sz w:val="20"/>
               </w:rPr>
@@ -3903,7 +3876,6 @@
             </w:pPr>
             <w:r>
               <w:rPr>
-                <w:rFonts w:ascii="Arial" w:hAnsi="Arial"/>
                 <w:color w:val="000000"/>
                 <w:sz w:val="20"/>
               </w:rPr>
@@ -4026,7 +3998,6 @@
             </w:pPr>
             <w:r>
               <w:rPr>
-                <w:rFonts w:ascii="Arial" w:hAnsi="Arial"/>
                 <w:color w:val="000000"/>
                 <w:sz w:val="20"/>
               </w:rPr>
@@ -4149,7 +4120,6 @@
             </w:pPr>
             <w:r>
               <w:rPr>
-                <w:rFonts w:ascii="Arial" w:hAnsi="Arial"/>
                 <w:color w:val="000000"/>
                 <w:sz w:val="20"/>
               </w:rPr>
@@ -4293,7 +4263,6 @@
             </w:pPr>
             <w:r>
               <w:rPr>
-                <w:rFonts w:ascii="Arial" w:hAnsi="Arial"/>
                 <w:color w:val="000000"/>
                 <w:sz w:val="20"/>
               </w:rPr>
@@ -4518,7 +4487,6 @@
             </w:pPr>
             <w:r>
               <w:rPr>
-                <w:rFonts w:ascii="Arial" w:hAnsi="Arial"/>
                 <w:color w:val="000000"/>
                 <w:sz w:val="20"/>
               </w:rPr>
@@ -4643,7 +4611,6 @@
             </w:pPr>
             <w:r>
               <w:rPr>
-                <w:rFonts w:ascii="Arial" w:hAnsi="Arial"/>
                 <w:color w:val="000000"/>
                 <w:sz w:val="20"/>
               </w:rPr>
@@ -4766,7 +4733,6 @@
             </w:pPr>
             <w:r>
               <w:rPr>
-                <w:rFonts w:ascii="Arial" w:hAnsi="Arial"/>
                 <w:color w:val="000000"/>
                 <w:sz w:val="20"/>
               </w:rPr>
@@ -4874,7 +4840,6 @@
             </w:pPr>
             <w:r>
               <w:rPr>
-                <w:rFonts w:ascii="Arial" w:hAnsi="Arial"/>
                 <w:color w:val="000000"/>
                 <w:sz w:val="20"/>
               </w:rPr>
@@ -4997,7 +4962,6 @@
             </w:pPr>
             <w:r>
               <w:rPr>
-                <w:rFonts w:ascii="Arial" w:hAnsi="Arial"/>
                 <w:color w:val="000000"/>
                 <w:sz w:val="20"/>
               </w:rPr>
@@ -5141,7 +5105,6 @@
             </w:pPr>
             <w:r>
               <w:rPr>
-                <w:rFonts w:ascii="Arial" w:hAnsi="Arial"/>
                 <w:color w:val="000000"/>
                 <w:sz w:val="20"/>
               </w:rPr>
@@ -5727,7 +5690,7 @@
           </mc:Choice>
           <mc:Fallback>
             <w:pict>
-              <v:shape w14:anchorId="6BDEDCD6" id="Graphic 11" o:spid="_x0000_s1026" style="position:absolute;margin-left:39.5pt;margin-top:7.75pt;width:514.1pt;height:.1pt;z-index:-15728128;visibility:visible;mso-wrap-style:square;mso-wrap-distance-left:0;mso-wrap-distance-top:0;mso-wrap-distance-right:0;mso-wrap-distance-bottom:0;mso-position-horizontal:absolute;mso-position-horizontal-relative:page;mso-position-vertical:absolute;mso-position-vertical-relative:text;v-text-anchor:top" coordsize="6529070,1270" o:gfxdata="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" path="m,l6528892,e" filled="f" strokeweight=".15467mm">
+              <v:shape w14:anchorId="524DBCE5" id="Graphic 11" o:spid="_x0000_s1026" style="position:absolute;margin-left:39.5pt;margin-top:7.75pt;width:514.1pt;height:.1pt;z-index:-15728128;visibility:visible;mso-wrap-style:square;mso-wrap-distance-left:0;mso-wrap-distance-top:0;mso-wrap-distance-right:0;mso-wrap-distance-bottom:0;mso-position-horizontal:absolute;mso-position-horizontal-relative:page;mso-position-vertical:absolute;mso-position-vertical-relative:text;v-text-anchor:top" coordsize="6529070,1270" o:gfxdata="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" path="m,l6528892,e" filled="f" strokeweight=".15467mm">
                 <v:path arrowok="t"/>
                 <w10:wrap type="topAndBottom" anchorx="page"/>
               </v:shape>
@@ -5939,6 +5902,13 @@
                 <w:sz w:val="14"/>
               </w:rPr>
             </w:pPr>
+            <w:r>
+              <w:rPr>
+                <w:color w:val="000000"/>
+                <w:sz w:val="20"/>
+              </w:rPr>
+              <w:t>{{ clearance(3, 1) }}</w:t>
+            </w:r>
           </w:p>
         </w:tc>
         <w:tc>
@@ -6063,11 +6033,10 @@
             </w:pPr>
             <w:r>
               <w:rPr>
-                <w:rFonts w:ascii="Arial" w:hAnsi="Arial"/>
                 <w:color w:val="000000"/>
                 <w:sz w:val="20"/>
               </w:rPr>
-              <w:t>{{ clearance(3, 1) }}</w:t>
+              <w:t>{{ clearance(3, 2) }}</w:t>
             </w:r>
           </w:p>
         </w:tc>
@@ -6186,11 +6155,10 @@
             </w:pPr>
             <w:r>
               <w:rPr>
-                <w:rFonts w:ascii="Arial" w:hAnsi="Arial"/>
                 <w:color w:val="000000"/>
                 <w:sz w:val="20"/>
               </w:rPr>
-              <w:t>{{ clearance(3, 2) }}</w:t>
+              <w:t>{{ clearance(3, 3) }}</w:t>
             </w:r>
           </w:p>
         </w:tc>
@@ -6309,11 +6277,10 @@
             </w:pPr>
             <w:r>
               <w:rPr>
-                <w:rFonts w:ascii="Arial" w:hAnsi="Arial"/>
                 <w:color w:val="000000"/>
                 <w:sz w:val="20"/>
               </w:rPr>
-              <w:t>{{ clearance(3, 3) }}</w:t>
+              <w:t>{{ clearance(3, 4) }}</w:t>
             </w:r>
           </w:p>
         </w:tc>
@@ -6447,11 +6414,10 @@
             </w:pPr>
             <w:r>
               <w:rPr>
-                <w:rFonts w:ascii="Arial" w:hAnsi="Arial"/>
                 <w:color w:val="000000"/>
                 <w:sz w:val="20"/>
               </w:rPr>
-              <w:t>{{ clearance(3, 4) }}</w:t>
+              <w:t>{{ clearance(3, 5) }}</w:t>
             </w:r>
           </w:p>
         </w:tc>
@@ -6570,11 +6536,10 @@
             </w:pPr>
             <w:r>
               <w:rPr>
-                <w:rFonts w:ascii="Arial" w:hAnsi="Arial"/>
                 <w:color w:val="000000"/>
                 <w:sz w:val="20"/>
               </w:rPr>
-              <w:t>{{ clearance(3, 5) }}</w:t>
+              <w:t>{{ clearance(3, 6) }}</w:t>
             </w:r>
           </w:p>
         </w:tc>
@@ -6708,11 +6673,10 @@
             </w:pPr>
             <w:r>
               <w:rPr>
-                <w:rFonts w:ascii="Arial" w:hAnsi="Arial"/>
                 <w:color w:val="000000"/>
                 <w:sz w:val="20"/>
               </w:rPr>
-              <w:t>{{ clearance(3, 6) }}</w:t>
+              <w:t>{{ clearance(3, 7) }}</w:t>
             </w:r>
           </w:p>
         </w:tc>
@@ -6859,11 +6823,10 @@
             </w:pPr>
             <w:r>
               <w:rPr>
-                <w:rFonts w:ascii="Arial" w:hAnsi="Arial"/>
                 <w:color w:val="000000"/>
                 <w:sz w:val="20"/>
               </w:rPr>
-              <w:t>{{ clearance(3, 7) }}</w:t>
+              <w:t>{{ clearance(3, 8) }}</w:t>
             </w:r>
           </w:p>
         </w:tc>
@@ -7037,11 +7000,10 @@
             </w:pPr>
             <w:r>
               <w:rPr>
-                <w:rFonts w:ascii="Arial" w:hAnsi="Arial"/>
                 <w:color w:val="000000"/>
                 <w:sz w:val="20"/>
               </w:rPr>
-              <w:t>{{ clearance(3, 8) }}</w:t>
+              <w:t>{{ clearance(3, 9) }}</w:t>
             </w:r>
           </w:p>
         </w:tc>
@@ -7192,11 +7154,10 @@
             </w:pPr>
             <w:r>
               <w:rPr>
-                <w:rFonts w:ascii="Arial" w:hAnsi="Arial"/>
                 <w:color w:val="000000"/>
                 <w:sz w:val="20"/>
               </w:rPr>
-              <w:t>{{ clearance(3, 9) }}</w:t>
+              <w:t>{{ clearance(3, 10) }}</w:t>
             </w:r>
           </w:p>
         </w:tc>
@@ -7392,11 +7353,10 @@
             </w:pPr>
             <w:r>
               <w:rPr>
-                <w:rFonts w:ascii="Arial" w:hAnsi="Arial"/>
                 <w:color w:val="000000"/>
                 <w:sz w:val="20"/>
               </w:rPr>
-              <w:t>{{ clearance(3, 10) }}</w:t>
+              <w:t>{{ clearance(3, 11) }}</w:t>
             </w:r>
           </w:p>
         </w:tc>
@@ -7542,11 +7502,10 @@
             </w:pPr>
             <w:r>
               <w:rPr>
-                <w:rFonts w:ascii="Arial" w:hAnsi="Arial"/>
                 <w:color w:val="000000"/>
                 <w:sz w:val="20"/>
               </w:rPr>
-              <w:t>{{ clearance(3, 11) }}</w:t>
+              <w:t>{{ clearance(3, 12) }}</w:t>
             </w:r>
           </w:p>
         </w:tc>
@@ -7667,11 +7626,10 @@
             </w:pPr>
             <w:r>
               <w:rPr>
-                <w:rFonts w:ascii="Arial" w:hAnsi="Arial"/>
                 <w:color w:val="000000"/>
                 <w:sz w:val="20"/>
               </w:rPr>
-              <w:t>{{ clearance(3, 12) }}</w:t>
+              <w:t>{{ clearance(3, 13) }}</w:t>
             </w:r>
           </w:p>
         </w:tc>
@@ -7815,11 +7773,24 @@
             </w:pPr>
             <w:r>
               <w:rPr>
-                <w:rFonts w:ascii="Arial" w:hAnsi="Arial"/>
                 <w:color w:val="000000"/>
                 <w:sz w:val="20"/>
               </w:rPr>
-              <w:t>{{ clearance(3, 13) }}</w:t>
+              <w:t>{{ clearance(3, 1</w:t>
+            </w:r>
+            <w:r>
+              <w:rPr>
+                <w:color w:val="000000"/>
+                <w:sz w:val="20"/>
+              </w:rPr>
+              <w:t>4</w:t>
+            </w:r>
+            <w:r>
+              <w:rPr>
+                <w:color w:val="000000"/>
+                <w:sz w:val="20"/>
+              </w:rPr>
+              <w:t>) }}</w:t>
             </w:r>
           </w:p>
         </w:tc>

</xml_diff>

<commit_message>
feat(clearance): merged Receiver/Dept-Head signature columns
Adds the merged signature columns to the Employee Clearance Form so the
picked submitter's signature (Receiver's Signature) and the manager's
signature (Department Head Signature) each render in a single merged cell
spanning all clearance items, alongside the preserved per-item Y/N marks.
Pairs with the backend fix that feeds {{ employee_sig }} from the submitter.

Verified end-to-end: generating a clearance form with a picked submitter
embeds the submitter's signature in the Receiver column and the manager's
in the Department Head column; per-item clearance marks unchanged.

Co-Authored-By: Claude Opus 4.8 (1M context) <noreply@anthropic.com>
</commit_message>
<xml_diff>
--- a/backend/templates/GSSG-HR_300-009_Employee_Clearance_Form_.docx
+++ b/backend/templates/GSSG-HR_300-009_Employee_Clearance_Form_.docx
@@ -2646,15 +2646,16 @@
             <w:tcBorders>
               <w:bottom w:val="single" w:sz="8" w:space="0" w:color="000000"/>
             </w:tcBorders>
-          </w:tcPr>
-          <w:p>
-            <w:pPr>
-              <w:pStyle w:val="TableParagraph"/>
-              <w:rPr>
-                <w:rFonts w:ascii="Times New Roman"/>
-                <w:sz w:val="16"/>
-              </w:rPr>
-            </w:pPr>
+            <w:vAlign w:val="center"/>
+          </w:tcPr>
+          <w:p>
+            <w:pPr>
+              <w:jc w:val="center"/>
+            </w:pPr>
+            <w:r/>
+            <w:r>
+              <w:t>{{ employee_sig }}</w:t>
+            </w:r>
           </w:p>
         </w:tc>
         <w:tc>
@@ -2664,15 +2665,16 @@
             <w:tcBorders>
               <w:bottom w:val="single" w:sz="8" w:space="0" w:color="000000"/>
             </w:tcBorders>
-          </w:tcPr>
-          <w:p>
-            <w:pPr>
-              <w:pStyle w:val="TableParagraph"/>
-              <w:rPr>
-                <w:rFonts w:ascii="Times New Roman"/>
-                <w:sz w:val="16"/>
-              </w:rPr>
-            </w:pPr>
+            <w:vAlign w:val="center"/>
+          </w:tcPr>
+          <w:p>
+            <w:pPr>
+              <w:jc w:val="center"/>
+            </w:pPr>
+            <w:r/>
+            <w:r>
+              <w:t>{{ manager_sig }}</w:t>
+            </w:r>
           </w:p>
         </w:tc>
       </w:tr>
@@ -4497,7 +4499,7 @@
         <w:tc>
           <w:tcPr>
             <w:tcW w:w="1827" w:type="dxa"/>
-            <w:vMerge w:val="restart"/>
+            <w:vMerge/>
             <w:tcBorders>
               <w:top w:val="single" w:sz="8" w:space="0" w:color="000000"/>
               <w:bottom w:val="single" w:sz="8" w:space="0" w:color="000000"/>
@@ -4516,7 +4518,7 @@
         <w:tc>
           <w:tcPr>
             <w:tcW w:w="1810" w:type="dxa"/>
-            <w:vMerge w:val="restart"/>
+            <w:vMerge/>
             <w:tcBorders>
               <w:top w:val="single" w:sz="8" w:space="0" w:color="000000"/>
               <w:bottom w:val="single" w:sz="8" w:space="0" w:color="000000"/>
@@ -5919,15 +5921,16 @@
               <w:left w:val="single" w:sz="4" w:space="0" w:color="000000"/>
               <w:right w:val="single" w:sz="4" w:space="0" w:color="000000"/>
             </w:tcBorders>
-          </w:tcPr>
-          <w:p>
-            <w:pPr>
-              <w:pStyle w:val="TableParagraph"/>
-              <w:rPr>
-                <w:rFonts w:ascii="Times New Roman"/>
-                <w:sz w:val="14"/>
-              </w:rPr>
-            </w:pPr>
+            <w:vAlign w:val="center"/>
+          </w:tcPr>
+          <w:p>
+            <w:pPr>
+              <w:jc w:val="center"/>
+            </w:pPr>
+            <w:r/>
+            <w:r>
+              <w:t>{{ employee_sig }}</w:t>
+            </w:r>
           </w:p>
         </w:tc>
         <w:tc>
@@ -5938,15 +5941,16 @@
               <w:left w:val="single" w:sz="4" w:space="0" w:color="000000"/>
               <w:right w:val="single" w:sz="4" w:space="0" w:color="000000"/>
             </w:tcBorders>
-          </w:tcPr>
-          <w:p>
-            <w:pPr>
-              <w:pStyle w:val="TableParagraph"/>
-              <w:rPr>
-                <w:rFonts w:ascii="Times New Roman"/>
-                <w:sz w:val="14"/>
-              </w:rPr>
-            </w:pPr>
+            <w:vAlign w:val="center"/>
+          </w:tcPr>
+          <w:p>
+            <w:pPr>
+              <w:jc w:val="center"/>
+            </w:pPr>
+            <w:r/>
+            <w:r>
+              <w:t>{{ manager_sig }}</w:t>
+            </w:r>
           </w:p>
         </w:tc>
       </w:tr>
@@ -7010,6 +7014,7 @@
         <w:tc>
           <w:tcPr>
             <w:tcW w:w="1827" w:type="dxa"/>
+            <w:vMerge/>
             <w:tcBorders>
               <w:left w:val="single" w:sz="4" w:space="0" w:color="000000"/>
               <w:bottom w:val="single" w:sz="4" w:space="0" w:color="000000"/>
@@ -7029,7 +7034,7 @@
         <w:tc>
           <w:tcPr>
             <w:tcW w:w="1810" w:type="dxa"/>
-            <w:vMerge w:val="restart"/>
+            <w:vMerge/>
             <w:tcBorders>
               <w:left w:val="single" w:sz="4" w:space="0" w:color="000000"/>
               <w:bottom w:val="single" w:sz="4" w:space="0" w:color="000000"/>
@@ -7164,6 +7169,7 @@
         <w:tc>
           <w:tcPr>
             <w:tcW w:w="1827" w:type="dxa"/>
+            <w:vMerge/>
             <w:tcBorders>
               <w:top w:val="single" w:sz="4" w:space="0" w:color="000000"/>
               <w:left w:val="single" w:sz="4" w:space="0" w:color="000000"/>
@@ -7363,6 +7369,7 @@
         <w:tc>
           <w:tcPr>
             <w:tcW w:w="1827" w:type="dxa"/>
+            <w:vMerge/>
             <w:tcBorders>
               <w:top w:val="single" w:sz="4" w:space="0" w:color="000000"/>
               <w:left w:val="single" w:sz="4" w:space="0" w:color="000000"/>
@@ -7382,7 +7389,7 @@
         <w:tc>
           <w:tcPr>
             <w:tcW w:w="1810" w:type="dxa"/>
-            <w:vMerge w:val="restart"/>
+            <w:vMerge/>
             <w:tcBorders>
               <w:top w:val="single" w:sz="4" w:space="0" w:color="000000"/>
               <w:left w:val="single" w:sz="4" w:space="0" w:color="000000"/>
@@ -7512,6 +7519,7 @@
         <w:tc>
           <w:tcPr>
             <w:tcW w:w="1827" w:type="dxa"/>
+            <w:vMerge/>
             <w:tcBorders>
               <w:left w:val="single" w:sz="4" w:space="0" w:color="000000"/>
               <w:right w:val="single" w:sz="4" w:space="0" w:color="000000"/>
@@ -7636,6 +7644,7 @@
         <w:tc>
           <w:tcPr>
             <w:tcW w:w="1827" w:type="dxa"/>
+            <w:vMerge/>
             <w:tcBorders>
               <w:left w:val="single" w:sz="4" w:space="0" w:color="000000"/>
               <w:right w:val="single" w:sz="4" w:space="0" w:color="000000"/>
@@ -7797,6 +7806,7 @@
         <w:tc>
           <w:tcPr>
             <w:tcW w:w="1827" w:type="dxa"/>
+            <w:vMerge/>
             <w:tcBorders>
               <w:left w:val="single" w:sz="4" w:space="0" w:color="000000"/>
               <w:right w:val="single" w:sz="4" w:space="0" w:color="000000"/>

</xml_diff>

<commit_message>
fix(clearance): drop manager sig from HR Manager cell; enlarge table sigs to 24mm
The HR Manager cell is signed by HR, not the picked manager, so the
{{ manager_sig }} token there was removed (HR signs manually). The
per-row Department Head / Receiver signatures were too small at 18mm —
bump the clearance signature width to 24mm (still fits the ~7.4mm rows).

Co-Authored-By: Claude Opus 4.8 (1M context) <noreply@anthropic.com>
</commit_message>
<xml_diff>
--- a/backend/templates/GSSG-HR_300-009_Employee_Clearance_Form_.docx
+++ b/backend/templates/GSSG-HR_300-009_Employee_Clearance_Form_.docx
@@ -69,7 +69,7 @@
                 <w:sz w:val="20"/>
               </w:rPr>
               <w:drawing>
-                <wp:inline distT="0" distB="0" distL="0" distR="0" wp14:anchorId="15137D92" wp14:editId="27C50AEE">
+                <wp:inline distT="0" distB="0" distL="0" distR="0" wp14:anchorId="5C728755" wp14:editId="30BEAEE8">
                   <wp:extent cx="896112" cy="896111"/>
                   <wp:effectExtent l="0" t="0" r="0" b="0"/>
                   <wp:docPr id="1" name="Image 1"/>
@@ -119,7 +119,7 @@
                 <w:sz w:val="20"/>
               </w:rPr>
               <w:drawing>
-                <wp:inline distT="0" distB="0" distL="0" distR="0" wp14:anchorId="4D410B7A" wp14:editId="536217F1">
+                <wp:inline distT="0" distB="0" distL="0" distR="0" wp14:anchorId="1E48CAC2" wp14:editId="69972B19">
                   <wp:extent cx="446251" cy="594359"/>
                   <wp:effectExtent l="0" t="0" r="0" b="0"/>
                   <wp:docPr id="2" name="Image 2"/>
@@ -642,7 +642,7 @@
         <mc:AlternateContent>
           <mc:Choice Requires="wpg">
             <w:drawing>
-              <wp:anchor distT="0" distB="0" distL="0" distR="0" simplePos="0" relativeHeight="15728640" behindDoc="0" locked="0" layoutInCell="1" allowOverlap="1" wp14:anchorId="753D6378" wp14:editId="4F1DFA83">
+              <wp:anchor distT="0" distB="0" distL="0" distR="0" simplePos="0" relativeHeight="15728640" behindDoc="0" locked="0" layoutInCell="1" allowOverlap="1" wp14:anchorId="675D47E1" wp14:editId="009B6EDD">
                 <wp:simplePos x="0" y="0"/>
                 <wp:positionH relativeFrom="page">
                   <wp:posOffset>0</wp:posOffset>
@@ -1137,7 +1137,7 @@
           </mc:Choice>
           <mc:Fallback>
             <w:pict>
-              <v:group w14:anchorId="753D6378" id="Group 3" o:spid="_x0000_s1026" style="position:absolute;margin-left:0;margin-top:756.25pt;width:595.35pt;height:85.7pt;z-index:15728640;mso-wrap-distance-left:0;mso-wrap-distance-right:0;mso-position-horizontal-relative:page;mso-position-vertical-relative:page" coordsize="75609,10883" o:gfxdata="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">
+              <v:group w14:anchorId="675D47E1" id="Group 3" o:spid="_x0000_s1026" style="position:absolute;margin-left:0;margin-top:756.25pt;width:595.35pt;height:85.7pt;z-index:15728640;mso-wrap-distance-left:0;mso-wrap-distance-right:0;mso-position-horizontal-relative:page;mso-position-vertical-relative:page" coordsize="75609,10883" o:gfxdata="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">
                 <v:shape id="Graphic 4" o:spid="_x0000_s1027" style="position:absolute;left:20954;width:54655;height:10883;visibility:visible;mso-wrap-style:square;v-text-anchor:top" coordsize="5465445,1088390" o:gfxdata="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" path="m5465108,l,1087947r5465108,l5465108,xe" fillcolor="#003760" stroked="f">
                   <v:path arrowok="t"/>
                 </v:shape>
@@ -2652,7 +2652,6 @@
             <w:pPr>
               <w:jc w:val="center"/>
             </w:pPr>
-            <w:r/>
             <w:r>
               <w:t>{{ employee_sig }}</w:t>
             </w:r>
@@ -2671,7 +2670,6 @@
             <w:pPr>
               <w:jc w:val="center"/>
             </w:pPr>
-            <w:r/>
             <w:r>
               <w:t>{{ manager_sig }}</w:t>
             </w:r>
@@ -5188,7 +5186,7 @@
         <mc:AlternateContent>
           <mc:Choice Requires="wpg">
             <w:drawing>
-              <wp:anchor distT="0" distB="0" distL="0" distR="0" simplePos="0" relativeHeight="15730176" behindDoc="0" locked="0" layoutInCell="1" allowOverlap="1" wp14:anchorId="4C20609C" wp14:editId="11272587">
+              <wp:anchor distT="0" distB="0" distL="0" distR="0" simplePos="0" relativeHeight="15730176" behindDoc="0" locked="0" layoutInCell="1" allowOverlap="1" wp14:anchorId="65F8CBE1" wp14:editId="14B26E67">
                 <wp:simplePos x="0" y="0"/>
                 <wp:positionH relativeFrom="page">
                   <wp:posOffset>0</wp:posOffset>
@@ -5306,7 +5304,7 @@
           </mc:Choice>
           <mc:Fallback>
             <w:pict>
-              <v:group w14:anchorId="4C20609C" id="Group 8" o:spid="_x0000_s1031" style="position:absolute;left:0;text-align:left;margin-left:0;margin-top:788.65pt;width:287.8pt;height:53.3pt;z-index:15730176;mso-wrap-distance-left:0;mso-wrap-distance-right:0;mso-position-horizontal-relative:page;mso-position-vertical-relative:page" coordsize="36550,6769" o:gfxdata="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">
+              <v:group w14:anchorId="65F8CBE1" id="Group 8" o:spid="_x0000_s1031" style="position:absolute;left:0;text-align:left;margin-left:0;margin-top:788.65pt;width:287.8pt;height:53.3pt;z-index:15730176;mso-wrap-distance-left:0;mso-wrap-distance-right:0;mso-position-horizontal-relative:page;mso-position-vertical-relative:page" coordsize="36550,6769" o:gfxdata="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">
                 <v:shape id="Graphic 9" o:spid="_x0000_s1032" style="position:absolute;width:36550;height:6769;visibility:visible;mso-wrap-style:square;v-text-anchor:top" coordsize="3655060,676910" o:gfxdata="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" path="m,l,676350r3654844,l,xe" fillcolor="#c20000" stroked="f">
                   <v:path arrowok="t"/>
                 </v:shape>
@@ -5628,7 +5626,7 @@
         <mc:AlternateContent>
           <mc:Choice Requires="wps">
             <w:drawing>
-              <wp:anchor distT="0" distB="0" distL="0" distR="0" simplePos="0" relativeHeight="487588352" behindDoc="1" locked="0" layoutInCell="1" allowOverlap="1" wp14:anchorId="25D77241" wp14:editId="5546E2A8">
+              <wp:anchor distT="0" distB="0" distL="0" distR="0" simplePos="0" relativeHeight="487588352" behindDoc="1" locked="0" layoutInCell="1" allowOverlap="1" wp14:anchorId="1C42276F" wp14:editId="30EF81C6">
                 <wp:simplePos x="0" y="0"/>
                 <wp:positionH relativeFrom="page">
                   <wp:posOffset>501395</wp:posOffset>
@@ -5692,7 +5690,7 @@
           </mc:Choice>
           <mc:Fallback>
             <w:pict>
-              <v:shape w14:anchorId="524DBCE5" id="Graphic 11" o:spid="_x0000_s1026" style="position:absolute;margin-left:39.5pt;margin-top:7.75pt;width:514.1pt;height:.1pt;z-index:-15728128;visibility:visible;mso-wrap-style:square;mso-wrap-distance-left:0;mso-wrap-distance-top:0;mso-wrap-distance-right:0;mso-wrap-distance-bottom:0;mso-position-horizontal:absolute;mso-position-horizontal-relative:page;mso-position-vertical:absolute;mso-position-vertical-relative:text;v-text-anchor:top" coordsize="6529070,1270" o:gfxdata="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" path="m,l6528892,e" filled="f" strokeweight=".15467mm">
+              <v:shape w14:anchorId="41D3639C" id="Graphic 11" o:spid="_x0000_s1026" style="position:absolute;margin-left:39.5pt;margin-top:7.75pt;width:514.1pt;height:.1pt;z-index:-15728128;visibility:visible;mso-wrap-style:square;mso-wrap-distance-left:0;mso-wrap-distance-top:0;mso-wrap-distance-right:0;mso-wrap-distance-bottom:0;mso-position-horizontal:absolute;mso-position-horizontal-relative:page;mso-position-vertical:absolute;mso-position-vertical-relative:text;v-text-anchor:top" coordsize="6529070,1270" o:gfxdata="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" path="m,l6528892,e" filled="f" strokeweight=".15467mm">
                 <v:path arrowok="t"/>
                 <w10:wrap type="topAndBottom" anchorx="page"/>
               </v:shape>
@@ -5927,7 +5925,6 @@
             <w:pPr>
               <w:jc w:val="center"/>
             </w:pPr>
-            <w:r/>
             <w:r>
               <w:t>{{ employee_sig }}</w:t>
             </w:r>
@@ -5947,7 +5944,6 @@
             <w:pPr>
               <w:jc w:val="center"/>
             </w:pPr>
-            <w:r/>
             <w:r>
               <w:t>{{ manager_sig }}</w:t>
             </w:r>
@@ -7785,21 +7781,7 @@
                 <w:color w:val="000000"/>
                 <w:sz w:val="20"/>
               </w:rPr>
-              <w:t>{{ clearance(3, 1</w:t>
-            </w:r>
-            <w:r>
-              <w:rPr>
-                <w:color w:val="000000"/>
-                <w:sz w:val="20"/>
-              </w:rPr>
-              <w:t>4</w:t>
-            </w:r>
-            <w:r>
-              <w:rPr>
-                <w:color w:val="000000"/>
-                <w:sz w:val="20"/>
-              </w:rPr>
-              <w:t>) }}</w:t>
+              <w:t>{{ clearance(3, 14) }}</w:t>
             </w:r>
           </w:p>
         </w:tc>
@@ -8298,9 +8280,6 @@
                 <w:sz w:val="14"/>
               </w:rPr>
             </w:pPr>
-            <w:r>
-              <w:t>{{ manager_sig }}</w:t>
-            </w:r>
           </w:p>
         </w:tc>
         <w:tc>
@@ -8528,7 +8507,7 @@
           <w:sz w:val="20"/>
         </w:rPr>
         <w:drawing>
-          <wp:anchor distT="0" distB="0" distL="0" distR="0" simplePos="0" relativeHeight="487588864" behindDoc="1" locked="0" layoutInCell="1" allowOverlap="1" wp14:anchorId="1B7225F8" wp14:editId="052753E5">
+          <wp:anchor distT="0" distB="0" distL="0" distR="0" simplePos="0" relativeHeight="487588864" behindDoc="1" locked="0" layoutInCell="1" allowOverlap="1" wp14:anchorId="6F526876" wp14:editId="477E6769">
             <wp:simplePos x="0" y="0"/>
             <wp:positionH relativeFrom="page">
               <wp:posOffset>5996940</wp:posOffset>

</xml_diff>